<commit_message>
feat: add initial stadium ticket booking simulation data and views
</commit_message>
<xml_diff>
--- a/.diagram/mermaid-class-diagram.docx
+++ b/.diagram/mermaid-class-diagram.docx
@@ -594,6 +594,16 @@
     </w:p>
     <w:p>
       <w:r>
+        <w:t xml:space="preserve">        +displayFanManagementMenu(): void</w:t>
+      </w:r>
+    </w:p>
+    <w:p>
+      <w:r>
+        <w:t xml:space="preserve">        +displayOrganizerManagementMenu(): void</w:t>
+      </w:r>
+    </w:p>
+    <w:p>
+      <w:r>
         <w:t xml:space="preserve">        +</w:t>
       </w:r>
       <w:proofErr w:type="spellStart"/>
@@ -1738,6 +1748,11 @@
     </w:p>
     <w:p>
       <w:r>
+        <w:t xml:space="preserve">        +rejectFanAccount(fanId: String): boolean</w:t>
+      </w:r>
+    </w:p>
+    <w:p>
+      <w:r>
         <w:t xml:space="preserve">        +</w:t>
       </w:r>
       <w:proofErr w:type="spellStart"/>
@@ -1816,6 +1831,11 @@
         <w:t>boolean</w:t>
       </w:r>
       <w:proofErr w:type="spellEnd"/>
+    </w:p>
+    <w:p>
+      <w:r>
+        <w:t xml:space="preserve">        +rejectOrganizerAccount(orgId: String): boolean</w:t>
+      </w:r>
     </w:p>
     <w:p>
       <w:r>

</xml_diff>